<commit_message>
fix: malformed WebSocket payloads, TSX fallback import, voice defaults; hermetic tests
- server: a bad base64 audio_chunk is rejected with error/bad_payload and non-numeric
  video_frame dimensions are coerced to 0, instead of ending the connection
- dynamic agent: the offline TSX template emitted an invalid import line
- .env.example, README and the streaming docstring now state the real voice defaults (500/500 ms)
- tests/conftest.py blanks LLM provider keys for non-live tests so the suite never reaches a
  real provider via .env; regression tests for each fix
- docs: update the affected chapters and write numbered lists explicitly so Word does not
  continue numbering across lists

Co-Authored-By: Claude Sonnet 5.5 <noreply@anthropic.com>
</commit_message>
<xml_diff>
--- a/docs/00_judges_guide.docx
+++ b/docs/00_judges_guide.docx
@@ -157,8 +157,14 @@
     </w:p>
     <w:p>
       <w:pPr>
-        <w:pStyle w:val="ListNumber"/>
+        <w:ind w:left="510" w:hanging="340"/>
       </w:pPr>
+      <w:r>
+        <w:rPr>
+          <w:b w:val="0"/>
+        </w:rPr>
+        <w:t xml:space="preserve">1.  </w:t>
+      </w:r>
       <w:r>
         <w:rPr>
           <w:b/>
@@ -200,8 +206,14 @@
     </w:p>
     <w:p>
       <w:pPr>
-        <w:pStyle w:val="ListNumber"/>
+        <w:ind w:left="510" w:hanging="340"/>
       </w:pPr>
+      <w:r>
+        <w:rPr>
+          <w:b w:val="0"/>
+        </w:rPr>
+        <w:t xml:space="preserve">2.  </w:t>
+      </w:r>
       <w:r>
         <w:rPr>
           <w:b/>
@@ -217,8 +229,14 @@
     </w:p>
     <w:p>
       <w:pPr>
-        <w:pStyle w:val="ListNumber"/>
+        <w:ind w:left="510" w:hanging="340"/>
       </w:pPr>
+      <w:r>
+        <w:rPr>
+          <w:b w:val="0"/>
+        </w:rPr>
+        <w:t xml:space="preserve">3.  </w:t>
+      </w:r>
       <w:r>
         <w:rPr>
           <w:b/>
@@ -234,8 +252,14 @@
     </w:p>
     <w:p>
       <w:pPr>
-        <w:pStyle w:val="ListNumber"/>
+        <w:ind w:left="510" w:hanging="340"/>
       </w:pPr>
+      <w:r>
+        <w:rPr>
+          <w:b w:val="0"/>
+        </w:rPr>
+        <w:t xml:space="preserve">4.  </w:t>
+      </w:r>
       <w:r>
         <w:rPr>
           <w:b/>
@@ -277,8 +301,14 @@
     </w:p>
     <w:p>
       <w:pPr>
-        <w:pStyle w:val="ListNumber"/>
+        <w:ind w:left="510" w:hanging="340"/>
       </w:pPr>
+      <w:r>
+        <w:rPr>
+          <w:b w:val="0"/>
+        </w:rPr>
+        <w:t xml:space="preserve">5.  </w:t>
+      </w:r>
       <w:r>
         <w:rPr>
           <w:b/>

</xml_diff>

<commit_message>
feat: Windows desktop app with in-app API key entry
- keystore + GET/PUT /settings/keys: per-user storage of Groq/OpenRouter keys, provider-side
  validation, origin/token protection, live backend swap via coordinator.reload_llm()
- web UI: first-run "Connect your AI provider" screen and Settings > API keys
- agent/desktop.py entry (first-run Piper voice download), Windows-aware launcher
  (Edge/Chrome lookup, %APPDATA%, UTF-8 console)
- packaging/: PyInstaller spec (no torch), Inno Setup installer, icon
- CI: build-desktop.yml builds, smoke-tests and publishes the installer and a portable zip
- tests, README, CLAUDE.md and a Desktop App docs chapter

Co-Authored-By: Claude Sonnet 5.5 <noreply@anthropic.com>
</commit_message>
<xml_diff>
--- a/docs/00_judges_guide.docx
+++ b/docs/00_judges_guide.docx
@@ -790,6 +790,38 @@
           </w:p>
         </w:tc>
       </w:tr>
+      <w:tr>
+        <w:tc>
+          <w:tcPr>
+            <w:tcW w:type="dxa" w:w="4873"/>
+          </w:tcPr>
+          <w:p>
+            <w:r/>
+            <w:r>
+              <w:rPr>
+                <w:b w:val="0"/>
+                <w:sz w:val="18"/>
+              </w:rPr>
+              <w:t>14 Desktop App</w:t>
+            </w:r>
+          </w:p>
+        </w:tc>
+        <w:tc>
+          <w:tcPr>
+            <w:tcW w:type="dxa" w:w="4873"/>
+          </w:tcPr>
+          <w:p>
+            <w:r/>
+            <w:r>
+              <w:rPr>
+                <w:b w:val="0"/>
+                <w:sz w:val="18"/>
+              </w:rPr>
+              <w:t>The Windows .exe: installer, API-key screen, packaging</w:t>
+            </w:r>
+          </w:p>
+        </w:tc>
+      </w:tr>
     </w:tbl>
     <w:p>
       <w:pPr>

</xml_diff>